<commit_message>
Correct email and phone in downloadable CV
</commit_message>
<xml_diff>
--- a/public/assets/ayman-cv.docx
+++ b/public/assets/ayman-cv.docx
@@ -72,7 +72,7 @@
           <w:rPr>
             <w:rStyle w:val="Hyperlink"/>
           </w:rPr>
-          <w:t xml:space="preserve">056339181 </w:t>
+          <w:t xml:space="preserve">0563359181 </w:t>
         </w:r>
         <w:r>
           <w:rPr>
@@ -95,7 +95,7 @@
             <w:u w:val="single"/>
             <w:rtl/>
           </w:rPr>
-          <w:t>aywise@gmail.com</w:t>
+          <w:t>aywisee@gmail.com</w:t>
         </w:r>
       </w:hyperlink>
     </w:p>

</xml_diff>